<commit_message>
Fine tune aesthetics and fomratting
</commit_message>
<xml_diff>
--- a/input/DSC502_Learner_Journey_Map.docx
+++ b/input/DSC502_Learner_Journey_Map.docx
@@ -235,21 +235,7 @@
               <w:rPr>
                 <w:color w:val="000000"/>
               </w:rPr>
-              <w:t xml:space="preserve"> </w:t>
-            </w:r>
-            <w:proofErr w:type="spellStart"/>
-            <w:r>
-              <w:rPr>
-                <w:color w:val="000000"/>
-              </w:rPr>
-              <w:t>Analyse</w:t>
-            </w:r>
-            <w:proofErr w:type="spellEnd"/>
-            <w:r>
-              <w:rPr>
-                <w:color w:val="000000"/>
-              </w:rPr>
-              <w:t xml:space="preserve"> and use digital tools and data responsibly in coding contexts.</w:t>
+              <w:t xml:space="preserve"> Analyse and use digital tools and data responsibly in coding contexts.</w:t>
             </w:r>
           </w:p>
           <w:p>
@@ -403,6 +389,7 @@
               <w:rPr>
                 <w:color w:val="F3F5F2"/>
               </w:rPr>
+              <w:lastRenderedPageBreak/>
               <w:t>1</w:t>
             </w:r>
           </w:p>
@@ -432,6 +419,24 @@
               <w:rPr>
                 <w:color w:val="000000"/>
               </w:rPr>
+              <w:t>You write your first line of Python code and get set up with the tools you will use all module</w:t>
+            </w:r>
+            <w:r>
+              <w:rPr>
+                <w:color w:val="000000"/>
+              </w:rPr>
+              <w:t xml:space="preserve">. You write your first line of Python code and get set up with the tools you will use all module. </w:t>
+            </w:r>
+          </w:p>
+          <w:p>
+            <w:pPr>
+              <w:pStyle w:val="ListBullet"/>
+              <w:spacing w:after="20"/>
+            </w:pPr>
+            <w:r>
+              <w:rPr>
+                <w:color w:val="000000"/>
+              </w:rPr>
               <w:t>Module philosophy and approach</w:t>
             </w:r>
           </w:p>
@@ -457,18 +462,6 @@
                 <w:color w:val="000000"/>
               </w:rPr>
               <w:t>The coding environment landscape</w:t>
-            </w:r>
-          </w:p>
-          <w:p>
-            <w:pPr>
-              <w:pStyle w:val="ListBullet"/>
-              <w:spacing w:after="20"/>
-            </w:pPr>
-            <w:r>
-              <w:rPr>
-                <w:color w:val="000000"/>
-              </w:rPr>
-              <w:t>Version control and cloud development</w:t>
             </w:r>
           </w:p>
           <w:p>
@@ -602,16 +595,8 @@
               <w:rPr>
                 <w:color w:val="000000"/>
               </w:rPr>
-              <w:t xml:space="preserve">Module orientation and </w:t>
-            </w:r>
-            <w:proofErr w:type="gramStart"/>
-            <w:r>
-              <w:rPr>
-                <w:color w:val="000000"/>
-              </w:rPr>
-              <w:t>ice-breaker</w:t>
-            </w:r>
-            <w:proofErr w:type="gramEnd"/>
+              <w:t>Module orientation and ice-breaker</w:t>
+            </w:r>
           </w:p>
           <w:p>
             <w:pPr>
@@ -630,45 +615,23 @@
               <w:pStyle w:val="ListBullet"/>
               <w:spacing w:after="20"/>
             </w:pPr>
-            <w:proofErr w:type="spellStart"/>
-            <w:r>
-              <w:rPr>
-                <w:color w:val="000000"/>
-              </w:rPr>
-              <w:t>TradeRoot</w:t>
-            </w:r>
-            <w:proofErr w:type="spellEnd"/>
-            <w:r>
-              <w:rPr>
-                <w:color w:val="000000"/>
-              </w:rPr>
-              <w:t xml:space="preserve"> proof-of-concept demo</w:t>
-            </w:r>
-          </w:p>
-          <w:p>
-            <w:pPr>
-              <w:pStyle w:val="ListBullet"/>
-              <w:spacing w:after="20"/>
-            </w:pPr>
-            <w:r>
-              <w:rPr>
-                <w:color w:val="000000"/>
-              </w:rPr>
-              <w:t xml:space="preserve">GitHub and </w:t>
-            </w:r>
-            <w:proofErr w:type="spellStart"/>
-            <w:r>
-              <w:rPr>
-                <w:color w:val="000000"/>
-              </w:rPr>
-              <w:t>Codespaces</w:t>
-            </w:r>
-            <w:proofErr w:type="spellEnd"/>
-            <w:r>
-              <w:rPr>
-                <w:color w:val="000000"/>
-              </w:rPr>
-              <w:t xml:space="preserve"> setup</w:t>
+            <w:r>
+              <w:rPr>
+                <w:color w:val="000000"/>
+              </w:rPr>
+              <w:t>TradeRoot proof-of-concept demo</w:t>
+            </w:r>
+          </w:p>
+          <w:p>
+            <w:pPr>
+              <w:pStyle w:val="ListBullet"/>
+              <w:spacing w:after="20"/>
+            </w:pPr>
+            <w:r>
+              <w:rPr>
+                <w:color w:val="000000"/>
+              </w:rPr>
+              <w:t>GitHub and Codespaces setup</w:t>
             </w:r>
           </w:p>
           <w:p>
@@ -692,21 +655,7 @@
               <w:rPr>
                 <w:color w:val="000000"/>
               </w:rPr>
-              <w:t xml:space="preserve">Homework: independent exercises on </w:t>
-            </w:r>
-            <w:proofErr w:type="spellStart"/>
-            <w:r>
-              <w:rPr>
-                <w:color w:val="000000"/>
-              </w:rPr>
-              <w:t>RideAlong</w:t>
-            </w:r>
-            <w:proofErr w:type="spellEnd"/>
-            <w:r>
-              <w:rPr>
-                <w:color w:val="000000"/>
-              </w:rPr>
-              <w:t xml:space="preserve"> scenario</w:t>
+              <w:t>Homework: independent exercises on RideAlong scenario</w:t>
             </w:r>
           </w:p>
         </w:tc>
@@ -759,6 +708,18 @@
               <w:rPr>
                 <w:color w:val="000000"/>
               </w:rPr>
+              <w:t>You make your code think, repeat, and respond - writing your first interactive programme</w:t>
+            </w:r>
+          </w:p>
+          <w:p>
+            <w:pPr>
+              <w:pStyle w:val="ListBullet"/>
+              <w:spacing w:after="20"/>
+            </w:pPr>
+            <w:r>
+              <w:rPr>
+                <w:color w:val="000000"/>
+              </w:rPr>
               <w:t>Conditional logic</w:t>
             </w:r>
           </w:p>
@@ -836,21 +797,7 @@
               <w:rPr>
                 <w:color w:val="000000"/>
               </w:rPr>
-              <w:t xml:space="preserve">Build a </w:t>
-            </w:r>
-            <w:proofErr w:type="spellStart"/>
-            <w:r>
-              <w:rPr>
-                <w:color w:val="000000"/>
-              </w:rPr>
-              <w:t>programme</w:t>
-            </w:r>
-            <w:proofErr w:type="spellEnd"/>
-            <w:r>
-              <w:rPr>
-                <w:color w:val="000000"/>
-              </w:rPr>
-              <w:t xml:space="preserve"> that accepts and responds to typed input</w:t>
+              <w:t>Build a programme that accepts and responds to typed input</w:t>
             </w:r>
           </w:p>
           <w:p>
@@ -909,16 +856,8 @@
               <w:rPr>
                 <w:color w:val="000000"/>
               </w:rPr>
-              <w:t xml:space="preserve">Culminating exercise: first interactive </w:t>
-            </w:r>
-            <w:proofErr w:type="spellStart"/>
-            <w:r>
-              <w:rPr>
-                <w:color w:val="000000"/>
-              </w:rPr>
-              <w:t>programme</w:t>
-            </w:r>
-            <w:proofErr w:type="spellEnd"/>
+              <w:t>Culminating exercise: first interactive programme</w:t>
+            </w:r>
           </w:p>
           <w:p>
             <w:pPr>
@@ -941,21 +880,7 @@
               <w:rPr>
                 <w:color w:val="000000"/>
               </w:rPr>
-              <w:t xml:space="preserve">Homework: </w:t>
-            </w:r>
-            <w:proofErr w:type="spellStart"/>
-            <w:r>
-              <w:rPr>
-                <w:color w:val="000000"/>
-              </w:rPr>
-              <w:t>RideAlong</w:t>
-            </w:r>
-            <w:proofErr w:type="spellEnd"/>
-            <w:r>
-              <w:rPr>
-                <w:color w:val="000000"/>
-              </w:rPr>
-              <w:t xml:space="preserve"> scenario exercises</w:t>
+              <w:t>Homework: RideAlong scenario exercises</w:t>
             </w:r>
           </w:p>
         </w:tc>
@@ -1007,6 +932,18 @@
               <w:rPr>
                 <w:color w:val="000000"/>
               </w:rPr>
+              <w:t>You learn to package code into reusable building blocks that form the foundation of every real application</w:t>
+            </w:r>
+          </w:p>
+          <w:p>
+            <w:pPr>
+              <w:pStyle w:val="ListBullet"/>
+              <w:spacing w:after="20"/>
+            </w:pPr>
+            <w:r>
+              <w:rPr>
+                <w:color w:val="000000"/>
+              </w:rPr>
               <w:t>Code reuse and modularity</w:t>
             </w:r>
           </w:p>
@@ -1167,21 +1104,7 @@
               <w:rPr>
                 <w:color w:val="000000"/>
               </w:rPr>
-              <w:t xml:space="preserve">Homework: </w:t>
-            </w:r>
-            <w:proofErr w:type="spellStart"/>
-            <w:r>
-              <w:rPr>
-                <w:color w:val="000000"/>
-              </w:rPr>
-              <w:t>RideAlong</w:t>
-            </w:r>
-            <w:proofErr w:type="spellEnd"/>
-            <w:r>
-              <w:rPr>
-                <w:color w:val="000000"/>
-              </w:rPr>
-              <w:t xml:space="preserve"> driver profile functions and fare estimator</w:t>
+              <w:t>Homework: RideAlong driver profile functions and fare estimator</w:t>
             </w:r>
           </w:p>
         </w:tc>
@@ -1234,6 +1157,18 @@
               <w:rPr>
                 <w:color w:val="000000"/>
               </w:rPr>
+              <w:t>You load, explore, and interrogate a real dataset to answer genuine business questions</w:t>
+            </w:r>
+          </w:p>
+          <w:p>
+            <w:pPr>
+              <w:pStyle w:val="ListBullet"/>
+              <w:spacing w:after="20"/>
+            </w:pPr>
+            <w:r>
+              <w:rPr>
+                <w:color w:val="000000"/>
+              </w:rPr>
               <w:t>Tabular data structures</w:t>
             </w:r>
           </w:p>
@@ -1319,39 +1254,23 @@
               <w:pStyle w:val="ListBullet"/>
               <w:spacing w:after="20"/>
             </w:pPr>
-            <w:proofErr w:type="spellStart"/>
-            <w:r>
-              <w:rPr>
-                <w:color w:val="000000"/>
-              </w:rPr>
-              <w:t>Summarise</w:t>
-            </w:r>
-            <w:proofErr w:type="spellEnd"/>
-            <w:r>
-              <w:rPr>
-                <w:color w:val="000000"/>
-              </w:rPr>
-              <w:t xml:space="preserve"> data by category and interpret the results</w:t>
-            </w:r>
-          </w:p>
-          <w:p>
-            <w:pPr>
-              <w:pStyle w:val="ListBullet"/>
-              <w:spacing w:after="20"/>
-            </w:pPr>
-            <w:proofErr w:type="spellStart"/>
-            <w:r>
-              <w:rPr>
-                <w:color w:val="000000"/>
-              </w:rPr>
-              <w:t>Recognise</w:t>
-            </w:r>
-            <w:proofErr w:type="spellEnd"/>
-            <w:r>
-              <w:rPr>
-                <w:color w:val="000000"/>
-              </w:rPr>
-              <w:t xml:space="preserve"> and handle missing values</w:t>
+            <w:r>
+              <w:rPr>
+                <w:color w:val="000000"/>
+              </w:rPr>
+              <w:t>Summarise data by category and interpret the results</w:t>
+            </w:r>
+          </w:p>
+          <w:p>
+            <w:pPr>
+              <w:pStyle w:val="ListBullet"/>
+              <w:spacing w:after="20"/>
+            </w:pPr>
+            <w:r>
+              <w:rPr>
+                <w:color w:val="000000"/>
+              </w:rPr>
+              <w:t>Recognise and handle missing values</w:t>
             </w:r>
           </w:p>
           <w:p>
@@ -1398,87 +1317,31 @@
               <w:rPr>
                 <w:color w:val="000000"/>
               </w:rPr>
-              <w:t xml:space="preserve">Session notebook: </w:t>
-            </w:r>
-            <w:proofErr w:type="spellStart"/>
-            <w:r>
-              <w:rPr>
-                <w:color w:val="000000"/>
-              </w:rPr>
-              <w:t>QuickBite</w:t>
-            </w:r>
-            <w:proofErr w:type="spellEnd"/>
-            <w:r>
-              <w:rPr>
-                <w:color w:val="000000"/>
-              </w:rPr>
-              <w:t xml:space="preserve"> dataset, exploration, filtering, sorting, </w:t>
-            </w:r>
-            <w:proofErr w:type="spellStart"/>
-            <w:r>
-              <w:rPr>
-                <w:color w:val="000000"/>
-              </w:rPr>
-              <w:t>groupby</w:t>
-            </w:r>
-            <w:proofErr w:type="spellEnd"/>
-            <w:r>
-              <w:rPr>
-                <w:color w:val="000000"/>
-              </w:rPr>
-              <w:t>, missing data</w:t>
-            </w:r>
-          </w:p>
-          <w:p>
-            <w:pPr>
-              <w:pStyle w:val="ListBullet"/>
-              <w:spacing w:after="20"/>
-            </w:pPr>
-            <w:r>
-              <w:rPr>
-                <w:color w:val="000000"/>
-              </w:rPr>
-              <w:t xml:space="preserve">Discussion: what business questions does </w:t>
-            </w:r>
-            <w:proofErr w:type="gramStart"/>
-            <w:r>
-              <w:rPr>
-                <w:color w:val="000000"/>
-              </w:rPr>
-              <w:t>grouped</w:t>
-            </w:r>
-            <w:proofErr w:type="gramEnd"/>
-            <w:r>
-              <w:rPr>
-                <w:color w:val="000000"/>
-              </w:rPr>
-              <w:t xml:space="preserve"> data answer?</w:t>
-            </w:r>
-          </w:p>
-          <w:p>
-            <w:pPr>
-              <w:pStyle w:val="ListBullet"/>
-              <w:spacing w:after="20"/>
-            </w:pPr>
-            <w:r>
-              <w:rPr>
-                <w:color w:val="000000"/>
-              </w:rPr>
-              <w:t xml:space="preserve">Homework: pandas exercises on </w:t>
-            </w:r>
-            <w:proofErr w:type="spellStart"/>
-            <w:r>
-              <w:rPr>
-                <w:color w:val="000000"/>
-              </w:rPr>
-              <w:t>RideAlong</w:t>
-            </w:r>
-            <w:proofErr w:type="spellEnd"/>
-            <w:r>
-              <w:rPr>
-                <w:color w:val="000000"/>
-              </w:rPr>
-              <w:t xml:space="preserve"> flat dataset</w:t>
+              <w:t>Session notebook: QuickBite dataset, exploration, filtering, sorting, groupby, missing data</w:t>
+            </w:r>
+          </w:p>
+          <w:p>
+            <w:pPr>
+              <w:pStyle w:val="ListBullet"/>
+              <w:spacing w:after="20"/>
+            </w:pPr>
+            <w:r>
+              <w:rPr>
+                <w:color w:val="000000"/>
+              </w:rPr>
+              <w:t>Discussion: what business questions does grouped data answer?</w:t>
+            </w:r>
+          </w:p>
+          <w:p>
+            <w:pPr>
+              <w:pStyle w:val="ListBullet"/>
+              <w:spacing w:after="20"/>
+            </w:pPr>
+            <w:r>
+              <w:rPr>
+                <w:color w:val="000000"/>
+              </w:rPr>
+              <w:t>Homework: pandas exercises on RideAlong flat dataset</w:t>
             </w:r>
           </w:p>
         </w:tc>
@@ -1530,6 +1393,18 @@
               <w:rPr>
                 <w:color w:val="000000"/>
               </w:rPr>
+              <w:t>You discover why serious products use relational databases and learn to query them directly</w:t>
+            </w:r>
+          </w:p>
+          <w:p>
+            <w:pPr>
+              <w:pStyle w:val="ListBullet"/>
+              <w:spacing w:after="20"/>
+            </w:pPr>
+            <w:r>
+              <w:rPr>
+                <w:color w:val="000000"/>
+              </w:rPr>
               <w:t>Relational data models</w:t>
             </w:r>
           </w:p>
@@ -1627,19 +1502,11 @@
               <w:pStyle w:val="ListBullet"/>
               <w:spacing w:after="20"/>
             </w:pPr>
-            <w:proofErr w:type="spellStart"/>
-            <w:r>
-              <w:rPr>
-                <w:color w:val="000000"/>
-              </w:rPr>
-              <w:t>Summarise</w:t>
-            </w:r>
-            <w:proofErr w:type="spellEnd"/>
-            <w:r>
-              <w:rPr>
-                <w:color w:val="000000"/>
-              </w:rPr>
-              <w:t xml:space="preserve"> data by category using aggregation</w:t>
+            <w:r>
+              <w:rPr>
+                <w:color w:val="000000"/>
+              </w:rPr>
+              <w:t>Summarise data by category using aggregation</w:t>
             </w:r>
           </w:p>
           <w:p>
@@ -1698,87 +1565,31 @@
               <w:rPr>
                 <w:color w:val="000000"/>
               </w:rPr>
-              <w:t xml:space="preserve">Session notebook: relational model, SQL basics, </w:t>
-            </w:r>
-            <w:proofErr w:type="spellStart"/>
-            <w:r>
-              <w:rPr>
-                <w:color w:val="000000"/>
-              </w:rPr>
-              <w:t>groupby</w:t>
-            </w:r>
-            <w:proofErr w:type="spellEnd"/>
-            <w:r>
-              <w:rPr>
-                <w:color w:val="000000"/>
-              </w:rPr>
-              <w:t xml:space="preserve"> and join exercises</w:t>
-            </w:r>
-          </w:p>
-          <w:p>
-            <w:pPr>
-              <w:pStyle w:val="ListBullet"/>
-              <w:spacing w:after="20"/>
-            </w:pPr>
-            <w:r>
-              <w:rPr>
-                <w:color w:val="000000"/>
-              </w:rPr>
-              <w:t xml:space="preserve">Discussion: what does </w:t>
-            </w:r>
-            <w:proofErr w:type="gramStart"/>
-            <w:r>
-              <w:rPr>
-                <w:color w:val="000000"/>
-              </w:rPr>
-              <w:t>a silently</w:t>
-            </w:r>
-            <w:proofErr w:type="gramEnd"/>
-            <w:r>
-              <w:rPr>
-                <w:color w:val="000000"/>
-              </w:rPr>
-              <w:t xml:space="preserve"> wrong result tell you vs an outright error?</w:t>
-            </w:r>
-          </w:p>
-          <w:p>
-            <w:pPr>
-              <w:pStyle w:val="ListBullet"/>
-              <w:spacing w:after="20"/>
-            </w:pPr>
-            <w:r>
-              <w:rPr>
-                <w:color w:val="000000"/>
-              </w:rPr>
-              <w:t xml:space="preserve">Homework: SQL exercises on </w:t>
-            </w:r>
-            <w:proofErr w:type="spellStart"/>
-            <w:r>
-              <w:rPr>
-                <w:color w:val="000000"/>
-              </w:rPr>
-              <w:t>RideAlong</w:t>
-            </w:r>
-            <w:proofErr w:type="spellEnd"/>
-            <w:r>
-              <w:rPr>
-                <w:color w:val="000000"/>
-              </w:rPr>
-              <w:t xml:space="preserve"> </w:t>
-            </w:r>
-            <w:proofErr w:type="spellStart"/>
-            <w:r>
-              <w:rPr>
-                <w:color w:val="000000"/>
-              </w:rPr>
-              <w:t>normalised</w:t>
-            </w:r>
-            <w:proofErr w:type="spellEnd"/>
-            <w:r>
-              <w:rPr>
-                <w:color w:val="000000"/>
-              </w:rPr>
-              <w:t xml:space="preserve"> schema</w:t>
+              <w:t>Session notebook: relational model, SQL basics, groupby and join exercises</w:t>
+            </w:r>
+          </w:p>
+          <w:p>
+            <w:pPr>
+              <w:pStyle w:val="ListBullet"/>
+              <w:spacing w:after="20"/>
+            </w:pPr>
+            <w:r>
+              <w:rPr>
+                <w:color w:val="000000"/>
+              </w:rPr>
+              <w:t>Discussion: what does a silently wrong result tell you vs an outright error?</w:t>
+            </w:r>
+          </w:p>
+          <w:p>
+            <w:pPr>
+              <w:pStyle w:val="ListBullet"/>
+              <w:spacing w:after="20"/>
+            </w:pPr>
+            <w:r>
+              <w:rPr>
+                <w:color w:val="000000"/>
+              </w:rPr>
+              <w:t>Homework: SQL exercises on RideAlong normalised schema</w:t>
             </w:r>
           </w:p>
         </w:tc>
@@ -1831,6 +1642,18 @@
               <w:rPr>
                 <w:color w:val="000000"/>
               </w:rPr>
+              <w:t>The module shifts gear: from writing code yourself to directing AI and evaluating what it produces</w:t>
+            </w:r>
+          </w:p>
+          <w:p>
+            <w:pPr>
+              <w:pStyle w:val="ListBullet"/>
+              <w:spacing w:after="20"/>
+            </w:pPr>
+            <w:r>
+              <w:rPr>
+                <w:color w:val="000000"/>
+              </w:rPr>
               <w:t>The Phase 2 shift</w:t>
             </w:r>
           </w:p>
@@ -1984,7 +1807,7 @@
               <w:rPr>
                 <w:color w:val="000000"/>
               </w:rPr>
-              <w:t>Assessment brief discussed in session.</w:t>
+              <w:t>Assessment brief discussed in session. Summative project work begins.</w:t>
             </w:r>
           </w:p>
         </w:tc>
@@ -2025,21 +1848,7 @@
               <w:rPr>
                 <w:color w:val="000000"/>
               </w:rPr>
-              <w:t xml:space="preserve">Discussion: </w:t>
-            </w:r>
-            <w:proofErr w:type="spellStart"/>
-            <w:r>
-              <w:rPr>
-                <w:color w:val="000000"/>
-              </w:rPr>
-              <w:t>Karpathy</w:t>
-            </w:r>
-            <w:proofErr w:type="spellEnd"/>
-            <w:r>
-              <w:rPr>
-                <w:color w:val="000000"/>
-              </w:rPr>
-              <w:t xml:space="preserve"> "Software 2.0" reaction (full room)</w:t>
+              <w:t>Discussion: Karpathy "Software 2.0" reaction (full room)</w:t>
             </w:r>
           </w:p>
           <w:p>
@@ -2140,6 +1949,18 @@
               <w:rPr>
                 <w:color w:val="000000"/>
               </w:rPr>
+              <w:t>You connect your code to the outside world, pulling in live data from external services</w:t>
+            </w:r>
+          </w:p>
+          <w:p>
+            <w:pPr>
+              <w:pStyle w:val="ListBullet"/>
+              <w:spacing w:after="20"/>
+            </w:pPr>
+            <w:r>
+              <w:rPr>
+                <w:color w:val="000000"/>
+              </w:rPr>
               <w:t>APIs and the request/response cycle</w:t>
             </w:r>
           </w:p>
@@ -2288,16 +2109,8 @@
               <w:rPr>
                 <w:color w:val="000000"/>
               </w:rPr>
-              <w:t xml:space="preserve">Secure credential handling introduced and </w:t>
-            </w:r>
-            <w:proofErr w:type="spellStart"/>
-            <w:r>
-              <w:rPr>
-                <w:color w:val="000000"/>
-              </w:rPr>
-              <w:t>practised</w:t>
-            </w:r>
-            <w:proofErr w:type="spellEnd"/>
+              <w:t>Secure credential handling introduced and practised</w:t>
+            </w:r>
           </w:p>
           <w:p>
             <w:pPr>
@@ -2343,6 +2156,7 @@
               <w:rPr>
                 <w:color w:val="F3F5F2"/>
               </w:rPr>
+              <w:lastRenderedPageBreak/>
               <w:t>8</w:t>
             </w:r>
           </w:p>
@@ -2372,6 +2186,18 @@
               <w:rPr>
                 <w:color w:val="000000"/>
               </w:rPr>
+              <w:t>You direct AI to generate whole features and application components, and learn to evaluate what comes back</w:t>
+            </w:r>
+          </w:p>
+          <w:p>
+            <w:pPr>
+              <w:pStyle w:val="ListBullet"/>
+              <w:spacing w:after="20"/>
+            </w:pPr>
+            <w:r>
+              <w:rPr>
+                <w:color w:val="000000"/>
+              </w:rPr>
               <w:t>Whole-application generation from natural language</w:t>
             </w:r>
           </w:p>
@@ -2384,21 +2210,7 @@
               <w:rPr>
                 <w:color w:val="000000"/>
               </w:rPr>
-              <w:t xml:space="preserve">The </w:t>
-            </w:r>
-            <w:proofErr w:type="gramStart"/>
-            <w:r>
-              <w:rPr>
-                <w:color w:val="000000"/>
-              </w:rPr>
-              <w:t>vibe coding</w:t>
-            </w:r>
-            <w:proofErr w:type="gramEnd"/>
-            <w:r>
-              <w:rPr>
-                <w:color w:val="000000"/>
-              </w:rPr>
-              <w:t xml:space="preserve"> tool landscape</w:t>
+              <w:t>The vibe coding tool landscape</w:t>
             </w:r>
           </w:p>
           <w:p>
@@ -2508,42 +2320,20 @@
               <w:rPr>
                 <w:color w:val="000000"/>
               </w:rPr>
-              <w:t xml:space="preserve">Micro-lecture: the </w:t>
-            </w:r>
-            <w:proofErr w:type="gramStart"/>
-            <w:r>
-              <w:rPr>
-                <w:color w:val="000000"/>
-              </w:rPr>
-              <w:t>vibe coding</w:t>
-            </w:r>
-            <w:proofErr w:type="gramEnd"/>
-            <w:r>
-              <w:rPr>
-                <w:color w:val="000000"/>
-              </w:rPr>
-              <w:t xml:space="preserve"> landscape</w:t>
-            </w:r>
-          </w:p>
-          <w:p>
-            <w:pPr>
-              <w:pStyle w:val="ListBullet"/>
-              <w:spacing w:after="20"/>
-            </w:pPr>
-            <w:r>
-              <w:rPr>
-                <w:color w:val="000000"/>
-              </w:rPr>
-              <w:t xml:space="preserve">Session: whole-feature generation and iteration in </w:t>
-            </w:r>
-            <w:proofErr w:type="spellStart"/>
-            <w:r>
-              <w:rPr>
-                <w:color w:val="000000"/>
-              </w:rPr>
-              <w:t>Codespaces</w:t>
-            </w:r>
-            <w:proofErr w:type="spellEnd"/>
+              <w:t>Micro-lecture: the vibe coding landscape</w:t>
+            </w:r>
+          </w:p>
+          <w:p>
+            <w:pPr>
+              <w:pStyle w:val="ListBullet"/>
+              <w:spacing w:after="20"/>
+            </w:pPr>
+            <w:r>
+              <w:rPr>
+                <w:color w:val="000000"/>
+              </w:rPr>
+              <w:t>Session: whole-feature generation and iteration in Codespaces</w:t>
+            </w:r>
           </w:p>
           <w:p>
             <w:pPr>
@@ -2589,7 +2379,6 @@
               <w:rPr>
                 <w:color w:val="F3F5F2"/>
               </w:rPr>
-              <w:lastRenderedPageBreak/>
               <w:t>9</w:t>
             </w:r>
           </w:p>
@@ -2607,17 +2396,20 @@
                 <w:b/>
                 <w:color w:val="000000"/>
               </w:rPr>
-              <w:t xml:space="preserve">Data </w:t>
-            </w:r>
-            <w:proofErr w:type="spellStart"/>
-            <w:r>
-              <w:rPr>
-                <w:b/>
-                <w:color w:val="000000"/>
-              </w:rPr>
-              <w:t>Visualisation</w:t>
-            </w:r>
-            <w:proofErr w:type="spellEnd"/>
+              <w:t>Data Visualisation</w:t>
+            </w:r>
+          </w:p>
+          <w:p>
+            <w:pPr>
+              <w:pStyle w:val="ListBullet"/>
+              <w:spacing w:after="20"/>
+            </w:pPr>
+            <w:r>
+              <w:rPr>
+                <w:color w:val="000000"/>
+              </w:rPr>
+              <w:t>You turn data into charts that communicate clearly to a real audience</w:t>
+            </w:r>
           </w:p>
           <w:p>
             <w:pPr>
@@ -2640,16 +2432,8 @@
               <w:rPr>
                 <w:color w:val="000000"/>
               </w:rPr>
-              <w:t xml:space="preserve">Exploratory vs presentational </w:t>
-            </w:r>
-            <w:proofErr w:type="spellStart"/>
-            <w:r>
-              <w:rPr>
-                <w:color w:val="000000"/>
-              </w:rPr>
-              <w:t>visualisation</w:t>
-            </w:r>
-            <w:proofErr w:type="spellEnd"/>
+              <w:t>Exploratory vs presentational visualisation</w:t>
+            </w:r>
           </w:p>
           <w:p>
             <w:pPr>
@@ -2701,21 +2485,7 @@
               <w:rPr>
                 <w:color w:val="000000"/>
               </w:rPr>
-              <w:t xml:space="preserve">Evaluate and adapt AI-generated </w:t>
-            </w:r>
-            <w:proofErr w:type="spellStart"/>
-            <w:r>
-              <w:rPr>
-                <w:color w:val="000000"/>
-              </w:rPr>
-              <w:t>visualisation</w:t>
-            </w:r>
-            <w:proofErr w:type="spellEnd"/>
-            <w:r>
-              <w:rPr>
-                <w:color w:val="000000"/>
-              </w:rPr>
-              <w:t xml:space="preserve"> code</w:t>
+              <w:t>Evaluate and adapt AI-generated visualisation code</w:t>
             </w:r>
           </w:p>
           <w:p>
@@ -2739,21 +2509,7 @@
               <w:rPr>
                 <w:color w:val="000000"/>
               </w:rPr>
-              <w:t xml:space="preserve">Integrate </w:t>
-            </w:r>
-            <w:proofErr w:type="spellStart"/>
-            <w:r>
-              <w:rPr>
-                <w:color w:val="000000"/>
-              </w:rPr>
-              <w:t>visualisations</w:t>
-            </w:r>
-            <w:proofErr w:type="spellEnd"/>
-            <w:r>
-              <w:rPr>
-                <w:color w:val="000000"/>
-              </w:rPr>
-              <w:t xml:space="preserve"> into a project as proper Python files</w:t>
+              <w:t>Integrate visualisations into a project as proper Python files</w:t>
             </w:r>
           </w:p>
         </w:tc>
@@ -2835,6 +2591,7 @@
               <w:rPr>
                 <w:color w:val="F3F5F2"/>
               </w:rPr>
+              <w:lastRenderedPageBreak/>
               <w:t>10</w:t>
             </w:r>
           </w:p>
@@ -2853,6 +2610,30 @@
                 <w:color w:val="000000"/>
               </w:rPr>
               <w:t>LLM Integration</w:t>
+            </w:r>
+          </w:p>
+          <w:p>
+            <w:pPr>
+              <w:pStyle w:val="ListBullet"/>
+              <w:spacing w:after="20"/>
+            </w:pPr>
+            <w:r>
+              <w:rPr>
+                <w:color w:val="000000"/>
+              </w:rPr>
+              <w:t>You embed a real AI feature into your application by calling a language model from Python</w:t>
+            </w:r>
+            <w:r>
+              <w:rPr>
+                <w:color w:val="000000"/>
+              </w:rPr>
+              <w:t xml:space="preserve">. </w:t>
+            </w:r>
+            <w:r>
+              <w:rPr>
+                <w:color w:val="000000"/>
+              </w:rPr>
+              <w:t>You embed a real AI feature into your application by calling a language model from Python</w:t>
             </w:r>
           </w:p>
           <w:p>
@@ -3000,21 +2781,7 @@
               <w:rPr>
                 <w:color w:val="000000"/>
               </w:rPr>
-              <w:t xml:space="preserve">Discussion: what does your AI feature </w:t>
-            </w:r>
-            <w:proofErr w:type="gramStart"/>
-            <w:r>
-              <w:rPr>
-                <w:color w:val="000000"/>
-              </w:rPr>
-              <w:t>actually do</w:t>
-            </w:r>
-            <w:proofErr w:type="gramEnd"/>
-            <w:r>
-              <w:rPr>
-                <w:color w:val="000000"/>
-              </w:rPr>
-              <w:t xml:space="preserve"> for the user?</w:t>
+              <w:t>Discussion: what does your AI feature actually do for the user?</w:t>
             </w:r>
           </w:p>
           <w:p>
@@ -3049,7 +2816,6 @@
               <w:rPr>
                 <w:color w:val="F3F5F2"/>
               </w:rPr>
-              <w:lastRenderedPageBreak/>
               <w:t>11</w:t>
             </w:r>
           </w:p>
@@ -3079,6 +2845,18 @@
               <w:rPr>
                 <w:color w:val="000000"/>
               </w:rPr>
+              <w:t>You deploy your application to a live URL that anyone in the world can visit</w:t>
+            </w:r>
+          </w:p>
+          <w:p>
+            <w:pPr>
+              <w:pStyle w:val="ListBullet"/>
+              <w:spacing w:after="20"/>
+            </w:pPr>
+            <w:r>
+              <w:rPr>
+                <w:color w:val="000000"/>
+              </w:rPr>
               <w:t>App frameworks and interfaces</w:t>
             </w:r>
           </w:p>
@@ -3201,21 +2979,7 @@
               <w:rPr>
                 <w:color w:val="000000"/>
               </w:rPr>
-              <w:t xml:space="preserve">Micro-lecture: </w:t>
-            </w:r>
-            <w:proofErr w:type="spellStart"/>
-            <w:r>
-              <w:rPr>
-                <w:color w:val="000000"/>
-              </w:rPr>
-              <w:t>Streamlit</w:t>
-            </w:r>
-            <w:proofErr w:type="spellEnd"/>
-            <w:r>
-              <w:rPr>
-                <w:color w:val="000000"/>
-              </w:rPr>
-              <w:t xml:space="preserve"> and deployment options</w:t>
+              <w:t>Micro-lecture: Streamlit and deployment options</w:t>
             </w:r>
           </w:p>
           <w:p>
@@ -3274,6 +3038,7 @@
               <w:rPr>
                 <w:color w:val="F3F5F2"/>
               </w:rPr>
+              <w:lastRenderedPageBreak/>
               <w:t>12</w:t>
             </w:r>
           </w:p>
@@ -3303,6 +3068,18 @@
               <w:rPr>
                 <w:color w:val="000000"/>
               </w:rPr>
+              <w:t>You pitch your live product to a panel, publish your portfolio, and reflect on what you built and how</w:t>
+            </w:r>
+          </w:p>
+          <w:p>
+            <w:pPr>
+              <w:pStyle w:val="ListBullet"/>
+              <w:spacing w:after="20"/>
+            </w:pPr>
+            <w:r>
+              <w:rPr>
+                <w:color w:val="000000"/>
+              </w:rPr>
               <w:t>Version control and commit history</w:t>
             </w:r>
           </w:p>
@@ -3438,6 +3215,12 @@
             <w:pPr>
               <w:spacing w:after="20"/>
             </w:pPr>
+            <w:r>
+              <w:rPr>
+                <w:color w:val="000000"/>
+              </w:rPr>
+              <w:t>Dragons Den pitches (formative)</w:t>
+            </w:r>
           </w:p>
         </w:tc>
         <w:tc>
@@ -3461,19 +3244,11 @@
               <w:pStyle w:val="ListBullet"/>
               <w:spacing w:after="20"/>
             </w:pPr>
-            <w:proofErr w:type="gramStart"/>
-            <w:r>
-              <w:rPr>
-                <w:color w:val="000000"/>
-              </w:rPr>
-              <w:t>Dragons</w:t>
-            </w:r>
-            <w:proofErr w:type="gramEnd"/>
-            <w:r>
-              <w:rPr>
-                <w:color w:val="000000"/>
-              </w:rPr>
-              <w:t xml:space="preserve"> Den pitches: five minutes each, live demo, four questions, panel feedback</w:t>
+            <w:r>
+              <w:rPr>
+                <w:color w:val="000000"/>
+              </w:rPr>
+              <w:t>Dragons Den pitches: five minutes each, live demo, four questions, panel feedback</w:t>
             </w:r>
           </w:p>
           <w:p>
@@ -3518,7 +3293,9 @@
     </w:p>
     <w:sectPr>
       <w:headerReference w:type="default" r:id="rId8"/>
-      <w:footerReference w:type="default" r:id="rId9"/>
+      <w:footerReference w:type="even" r:id="rId9"/>
+      <w:footerReference w:type="default" r:id="rId10"/>
+      <w:footerReference w:type="first" r:id="rId11"/>
       <w:pgSz w:w="15840" w:h="12240" w:orient="landscape"/>
       <w:pgMar w:top="1008" w:right="1152" w:bottom="1008" w:left="1152" w:header="259" w:footer="720" w:gutter="0"/>
       <w:cols w:space="720"/>
@@ -3558,40 +3335,138 @@
   <w:p>
     <w:pPr>
       <w:pStyle w:val="Footer"/>
+    </w:pPr>
+    <w:r>
+      <w:rPr>
+        <w:noProof/>
+      </w:rPr>
+      <mc:AlternateContent>
+        <mc:Choice Requires="wps">
+          <w:drawing>
+            <wp:anchor distT="0" distB="0" distL="0" distR="0" simplePos="0" relativeHeight="251659264" behindDoc="0" locked="0" layoutInCell="1" allowOverlap="1" wp14:anchorId="1D996BF2" wp14:editId="6A647BC6">
+              <wp:simplePos x="635" y="635"/>
+              <wp:positionH relativeFrom="page">
+                <wp:align>left</wp:align>
+              </wp:positionH>
+              <wp:positionV relativeFrom="page">
+                <wp:align>bottom</wp:align>
+              </wp:positionV>
+              <wp:extent cx="1855470" cy="333375"/>
+              <wp:effectExtent l="0" t="0" r="11430" b="0"/>
+              <wp:wrapNone/>
+              <wp:docPr id="1622844766" name="Text Box 2" descr="Regent's University London - Internal">
+                <a:extLst xmlns:a="http://schemas.openxmlformats.org/drawingml/2006/main">
+                  <a:ext uri="{5AE41FA2-C0FF-4470-9BD4-5FADCA87CBE2}">
+                    <aclsh:classification xmlns:aclsh="http://schemas.microsoft.com/office/drawing/2020/classificationShape" classificationOutcomeType="ftr"/>
+                  </a:ext>
+                </a:extLst>
+              </wp:docPr>
+              <wp:cNvGraphicFramePr/>
+              <a:graphic xmlns:a="http://schemas.openxmlformats.org/drawingml/2006/main">
+                <a:graphicData uri="http://schemas.microsoft.com/office/word/2010/wordprocessingShape">
+                  <wps:wsp>
+                    <wps:cNvSpPr txBox="1"/>
+                    <wps:spPr>
+                      <a:xfrm>
+                        <a:off x="0" y="0"/>
+                        <a:ext cx="1855470" cy="333375"/>
+                      </a:xfrm>
+                      <a:prstGeom prst="rect">
+                        <a:avLst/>
+                      </a:prstGeom>
+                      <a:noFill/>
+                      <a:ln>
+                        <a:noFill/>
+                      </a:ln>
+                    </wps:spPr>
+                    <wps:txbx>
+                      <w:txbxContent>
+                        <w:p>
+                          <w:pPr>
+                            <w:spacing w:after="0"/>
+                            <w:rPr>
+                              <w:rFonts w:ascii="Aptos" w:eastAsia="Aptos" w:hAnsi="Aptos" w:cs="Aptos"/>
+                              <w:noProof/>
+                              <w:color w:val="000000"/>
+                              <w:sz w:val="16"/>
+                              <w:szCs w:val="16"/>
+                            </w:rPr>
+                          </w:pPr>
+                          <w:r>
+                            <w:rPr>
+                              <w:rFonts w:ascii="Aptos" w:eastAsia="Aptos" w:hAnsi="Aptos" w:cs="Aptos"/>
+                              <w:noProof/>
+                              <w:color w:val="000000"/>
+                              <w:sz w:val="16"/>
+                              <w:szCs w:val="16"/>
+                            </w:rPr>
+                            <w:t>Regent's University London - Internal</w:t>
+                          </w:r>
+                        </w:p>
+                      </w:txbxContent>
+                    </wps:txbx>
+                    <wps:bodyPr rot="0" spcFirstLastPara="0" vertOverflow="overflow" horzOverflow="overflow" vert="horz" wrap="none" lIns="254000" tIns="0" rIns="0" bIns="190500" numCol="1" spcCol="0" rtlCol="0" fromWordArt="0" anchor="b" anchorCtr="0" forceAA="0" compatLnSpc="1">
+                      <a:prstTxWarp prst="textNoShape">
+                        <a:avLst/>
+                      </a:prstTxWarp>
+                      <a:spAutoFit/>
+                    </wps:bodyPr>
+                  </wps:wsp>
+                </a:graphicData>
+              </a:graphic>
+            </wp:anchor>
+          </w:drawing>
+        </mc:Choice>
+        <mc:Fallback>
+          <w:pict>
+            <v:shapetype w14:anchorId="1D996BF2" id="_x0000_t202" coordsize="21600,21600" o:spt="202" path="m,l,21600r21600,l21600,xe">
+              <v:stroke joinstyle="miter"/>
+              <v:path gradientshapeok="t" o:connecttype="rect"/>
+            </v:shapetype>
+            <v:shape id="Text Box 2" o:spid="_x0000_s1026" type="#_x0000_t202" alt="Regent's University London - Internal" style="position:absolute;margin-left:0;margin-top:0;width:146.1pt;height:26.25pt;z-index:251659264;visibility:visible;mso-wrap-style:none;mso-wrap-distance-left:0;mso-wrap-distance-top:0;mso-wrap-distance-right:0;mso-wrap-distance-bottom:0;mso-position-horizontal:left;mso-position-horizontal-relative:page;mso-position-vertical:bottom;mso-position-vertical-relative:page;v-text-anchor:bottom" o:gfxdata="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" filled="f" stroked="f">
+              <v:textbox style="mso-fit-shape-to-text:t" inset="20pt,0,0,15pt">
+                <w:txbxContent>
+                  <w:p>
+                    <w:pPr>
+                      <w:spacing w:after="0"/>
+                      <w:rPr>
+                        <w:rFonts w:ascii="Aptos" w:eastAsia="Aptos" w:hAnsi="Aptos" w:cs="Aptos"/>
+                        <w:noProof/>
+                        <w:color w:val="000000"/>
+                        <w:sz w:val="16"/>
+                        <w:szCs w:val="16"/>
+                      </w:rPr>
+                    </w:pPr>
+                    <w:r>
+                      <w:rPr>
+                        <w:rFonts w:ascii="Aptos" w:eastAsia="Aptos" w:hAnsi="Aptos" w:cs="Aptos"/>
+                        <w:noProof/>
+                        <w:color w:val="000000"/>
+                        <w:sz w:val="16"/>
+                        <w:szCs w:val="16"/>
+                      </w:rPr>
+                      <w:t>Regent's University London - Internal</w:t>
+                    </w:r>
+                  </w:p>
+                </w:txbxContent>
+              </v:textbox>
+              <w10:wrap anchorx="page" anchory="page"/>
+            </v:shape>
+          </w:pict>
+        </mc:Fallback>
+      </mc:AlternateContent>
+    </w:r>
+  </w:p>
+</w:ftr>
+</file>
+
+<file path=word/footer2.xml><?xml version="1.0" encoding="utf-8"?>
+<w:ftr xmlns:wpc="http://schemas.microsoft.com/office/word/2010/wordprocessingCanvas" xmlns:cx="http://schemas.microsoft.com/office/drawing/2014/chartex" xmlns:cx1="http://schemas.microsoft.com/office/drawing/2015/9/8/chartex" xmlns:cx2="http://schemas.microsoft.com/office/drawing/2015/10/21/chartex" xmlns:cx3="http://schemas.microsoft.com/office/drawing/2016/5/9/chartex" xmlns:cx4="http://schemas.microsoft.com/office/drawing/2016/5/10/chartex" xmlns:cx5="http://schemas.microsoft.com/office/drawing/2016/5/11/chartex" xmlns:cx6="http://schemas.microsoft.com/office/drawing/2016/5/12/chartex" xmlns:cx7="http://schemas.microsoft.com/office/drawing/2016/5/13/chartex" xmlns:cx8="http://schemas.microsoft.com/office/drawing/2016/5/14/chartex" xmlns:mc="http://schemas.openxmlformats.org/markup-compatibility/2006" xmlns:aink="http://schemas.microsoft.com/office/drawing/2016/ink" xmlns:am3d="http://schemas.microsoft.com/office/drawing/2017/model3d" xmlns:o="urn:schemas-microsoft-com:office:office" xmlns:oel="http://schemas.microsoft.com/office/2019/extlst" xmlns:r="http://schemas.openxmlformats.org/officeDocument/2006/relationships" xmlns:m="http://schemas.openxmlformats.org/officeDocument/2006/math" xmlns:v="urn:schemas-microsoft-com:vml" xmlns:wp14="http://schemas.microsoft.com/office/word/2010/wordprocessingDrawing" xmlns:wp="http://schemas.openxmlformats.org/drawingml/2006/wordprocessingDrawing" xmlns:w10="urn:schemas-microsoft-com:office:word" xmlns:w="http://schemas.openxmlformats.org/wordprocessingml/2006/main" xmlns:w14="http://schemas.microsoft.com/office/word/2010/wordml" xmlns:w15="http://schemas.microsoft.com/office/word/2012/wordml" xmlns:w16cex="http://schemas.microsoft.com/office/word/2018/wordml/cex" xmlns:w16cid="http://schemas.microsoft.com/office/word/2016/wordml/cid" xmlns:w16="http://schemas.microsoft.com/office/word/2018/wordml" xmlns:w16du="http://schemas.microsoft.com/office/word/2023/wordml/word16du" xmlns:w16sdtdh="http://schemas.microsoft.com/office/word/2020/wordml/sdtdatahash" xmlns:w16sdtfl="http://schemas.microsoft.com/office/word/2024/wordml/sdtformatlock" xmlns:w16se="http://schemas.microsoft.com/office/word/2015/wordml/symex" xmlns:wpg="http://schemas.microsoft.com/office/word/2010/wordprocessingGroup" xmlns:wpi="http://schemas.microsoft.com/office/word/2010/wordprocessingInk" xmlns:wne="http://schemas.microsoft.com/office/word/2006/wordml" xmlns:wps="http://schemas.microsoft.com/office/word/2010/wordprocessingShape" mc:Ignorable="w14 w15 w16se w16cid w16 w16cex w16sdtdh w16sdtfl w16du wp14">
+  <w:p>
+    <w:pPr>
+      <w:pStyle w:val="Footer"/>
       <w:jc w:val="center"/>
     </w:pPr>
-    <w:r>
-      <w:rPr>
-        <w:rFonts w:ascii="Calibri" w:hAnsi="Calibri"/>
-        <w:color w:val="646464"/>
-        <w:sz w:val="18"/>
-      </w:rPr>
-      <w:t xml:space="preserve">– </w:t>
-    </w:r>
-    <w:r>
-      <w:rPr>
-        <w:rFonts w:ascii="Calibri" w:hAnsi="Calibri"/>
-        <w:color w:val="646464"/>
-        <w:sz w:val="18"/>
-      </w:rPr>
-      <w:fldChar w:fldCharType="begin"/>
-    </w:r>
-    <w:r>
-      <w:rPr>
-        <w:rFonts w:ascii="Calibri" w:hAnsi="Calibri"/>
-        <w:color w:val="646464"/>
-        <w:sz w:val="18"/>
-      </w:rPr>
-      <w:instrText>PAGE</w:instrText>
-    </w:r>
-    <w:r>
-      <w:rPr>
-        <w:rFonts w:ascii="Calibri" w:hAnsi="Calibri"/>
-        <w:color w:val="646464"/>
-        <w:sz w:val="18"/>
-      </w:rPr>
-      <w:fldChar w:fldCharType="separate"/>
-    </w:r>
     <w:r>
       <w:rPr>
         <w:rFonts w:ascii="Calibri" w:hAnsi="Calibri"/>
@@ -3599,6 +3474,161 @@
         <w:color w:val="646464"/>
         <w:sz w:val="18"/>
       </w:rPr>
+      <mc:AlternateContent>
+        <mc:Choice Requires="wps">
+          <w:drawing>
+            <wp:anchor distT="0" distB="0" distL="0" distR="0" simplePos="0" relativeHeight="251660288" behindDoc="0" locked="0" layoutInCell="1" allowOverlap="1" wp14:anchorId="6F75164A" wp14:editId="61488897">
+              <wp:simplePos x="730250" y="7175500"/>
+              <wp:positionH relativeFrom="page">
+                <wp:align>left</wp:align>
+              </wp:positionH>
+              <wp:positionV relativeFrom="page">
+                <wp:align>bottom</wp:align>
+              </wp:positionV>
+              <wp:extent cx="1855470" cy="333375"/>
+              <wp:effectExtent l="0" t="0" r="11430" b="0"/>
+              <wp:wrapNone/>
+              <wp:docPr id="1864829379" name="Text Box 3" descr="Regent's University London - Internal">
+                <a:extLst xmlns:a="http://schemas.openxmlformats.org/drawingml/2006/main">
+                  <a:ext uri="{5AE41FA2-C0FF-4470-9BD4-5FADCA87CBE2}">
+                    <aclsh:classification xmlns:aclsh="http://schemas.microsoft.com/office/drawing/2020/classificationShape" classificationOutcomeType="ftr"/>
+                  </a:ext>
+                </a:extLst>
+              </wp:docPr>
+              <wp:cNvGraphicFramePr/>
+              <a:graphic xmlns:a="http://schemas.openxmlformats.org/drawingml/2006/main">
+                <a:graphicData uri="http://schemas.microsoft.com/office/word/2010/wordprocessingShape">
+                  <wps:wsp>
+                    <wps:cNvSpPr txBox="1"/>
+                    <wps:spPr>
+                      <a:xfrm>
+                        <a:off x="0" y="0"/>
+                        <a:ext cx="1855470" cy="333375"/>
+                      </a:xfrm>
+                      <a:prstGeom prst="rect">
+                        <a:avLst/>
+                      </a:prstGeom>
+                      <a:noFill/>
+                      <a:ln>
+                        <a:noFill/>
+                      </a:ln>
+                    </wps:spPr>
+                    <wps:txbx>
+                      <w:txbxContent>
+                        <w:p>
+                          <w:pPr>
+                            <w:spacing w:after="0"/>
+                            <w:rPr>
+                              <w:rFonts w:ascii="Aptos" w:eastAsia="Aptos" w:hAnsi="Aptos" w:cs="Aptos"/>
+                              <w:noProof/>
+                              <w:color w:val="000000"/>
+                              <w:sz w:val="16"/>
+                              <w:szCs w:val="16"/>
+                            </w:rPr>
+                          </w:pPr>
+                          <w:r>
+                            <w:rPr>
+                              <w:rFonts w:ascii="Aptos" w:eastAsia="Aptos" w:hAnsi="Aptos" w:cs="Aptos"/>
+                              <w:noProof/>
+                              <w:color w:val="000000"/>
+                              <w:sz w:val="16"/>
+                              <w:szCs w:val="16"/>
+                            </w:rPr>
+                            <w:t>Regent's University London - Internal</w:t>
+                          </w:r>
+                        </w:p>
+                      </w:txbxContent>
+                    </wps:txbx>
+                    <wps:bodyPr rot="0" spcFirstLastPara="0" vertOverflow="overflow" horzOverflow="overflow" vert="horz" wrap="none" lIns="254000" tIns="0" rIns="0" bIns="190500" numCol="1" spcCol="0" rtlCol="0" fromWordArt="0" anchor="b" anchorCtr="0" forceAA="0" compatLnSpc="1">
+                      <a:prstTxWarp prst="textNoShape">
+                        <a:avLst/>
+                      </a:prstTxWarp>
+                      <a:spAutoFit/>
+                    </wps:bodyPr>
+                  </wps:wsp>
+                </a:graphicData>
+              </a:graphic>
+            </wp:anchor>
+          </w:drawing>
+        </mc:Choice>
+        <mc:Fallback>
+          <w:pict>
+            <v:shapetype w14:anchorId="6F75164A" id="_x0000_t202" coordsize="21600,21600" o:spt="202" path="m,l,21600r21600,l21600,xe">
+              <v:stroke joinstyle="miter"/>
+              <v:path gradientshapeok="t" o:connecttype="rect"/>
+            </v:shapetype>
+            <v:shape id="Text Box 3" o:spid="_x0000_s1027" type="#_x0000_t202" alt="Regent's University London - Internal" style="position:absolute;left:0;text-align:left;margin-left:0;margin-top:0;width:146.1pt;height:26.25pt;z-index:251660288;visibility:visible;mso-wrap-style:none;mso-wrap-distance-left:0;mso-wrap-distance-top:0;mso-wrap-distance-right:0;mso-wrap-distance-bottom:0;mso-position-horizontal:left;mso-position-horizontal-relative:page;mso-position-vertical:bottom;mso-position-vertical-relative:page;v-text-anchor:bottom" o:gfxdata="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" filled="f" stroked="f">
+              <v:textbox style="mso-fit-shape-to-text:t" inset="20pt,0,0,15pt">
+                <w:txbxContent>
+                  <w:p>
+                    <w:pPr>
+                      <w:spacing w:after="0"/>
+                      <w:rPr>
+                        <w:rFonts w:ascii="Aptos" w:eastAsia="Aptos" w:hAnsi="Aptos" w:cs="Aptos"/>
+                        <w:noProof/>
+                        <w:color w:val="000000"/>
+                        <w:sz w:val="16"/>
+                        <w:szCs w:val="16"/>
+                      </w:rPr>
+                    </w:pPr>
+                    <w:r>
+                      <w:rPr>
+                        <w:rFonts w:ascii="Aptos" w:eastAsia="Aptos" w:hAnsi="Aptos" w:cs="Aptos"/>
+                        <w:noProof/>
+                        <w:color w:val="000000"/>
+                        <w:sz w:val="16"/>
+                        <w:szCs w:val="16"/>
+                      </w:rPr>
+                      <w:t>Regent's University London - Internal</w:t>
+                    </w:r>
+                  </w:p>
+                </w:txbxContent>
+              </v:textbox>
+              <w10:wrap anchorx="page" anchory="page"/>
+            </v:shape>
+          </w:pict>
+        </mc:Fallback>
+      </mc:AlternateContent>
+    </w:r>
+    <w:r>
+      <w:rPr>
+        <w:rFonts w:ascii="Calibri" w:hAnsi="Calibri"/>
+        <w:color w:val="646464"/>
+        <w:sz w:val="18"/>
+      </w:rPr>
+      <w:t xml:space="preserve">– </w:t>
+    </w:r>
+    <w:r>
+      <w:rPr>
+        <w:rFonts w:ascii="Calibri" w:hAnsi="Calibri"/>
+        <w:color w:val="646464"/>
+        <w:sz w:val="18"/>
+      </w:rPr>
+      <w:fldChar w:fldCharType="begin"/>
+    </w:r>
+    <w:r>
+      <w:rPr>
+        <w:rFonts w:ascii="Calibri" w:hAnsi="Calibri"/>
+        <w:color w:val="646464"/>
+        <w:sz w:val="18"/>
+      </w:rPr>
+      <w:instrText>PAGE</w:instrText>
+    </w:r>
+    <w:r>
+      <w:rPr>
+        <w:rFonts w:ascii="Calibri" w:hAnsi="Calibri"/>
+        <w:color w:val="646464"/>
+        <w:sz w:val="18"/>
+      </w:rPr>
+      <w:fldChar w:fldCharType="separate"/>
+    </w:r>
+    <w:r>
+      <w:rPr>
+        <w:rFonts w:ascii="Calibri" w:hAnsi="Calibri"/>
+        <w:noProof/>
+        <w:color w:val="646464"/>
+        <w:sz w:val="18"/>
+      </w:rPr>
       <w:t>1</w:t>
     </w:r>
     <w:r>
@@ -3616,6 +3646,136 @@
         <w:sz w:val="18"/>
       </w:rPr>
       <w:t xml:space="preserve"> –</w:t>
+    </w:r>
+  </w:p>
+</w:ftr>
+</file>
+
+<file path=word/footer3.xml><?xml version="1.0" encoding="utf-8"?>
+<w:ftr xmlns:wpc="http://schemas.microsoft.com/office/word/2010/wordprocessingCanvas" xmlns:cx="http://schemas.microsoft.com/office/drawing/2014/chartex" xmlns:cx1="http://schemas.microsoft.com/office/drawing/2015/9/8/chartex" xmlns:cx2="http://schemas.microsoft.com/office/drawing/2015/10/21/chartex" xmlns:cx3="http://schemas.microsoft.com/office/drawing/2016/5/9/chartex" xmlns:cx4="http://schemas.microsoft.com/office/drawing/2016/5/10/chartex" xmlns:cx5="http://schemas.microsoft.com/office/drawing/2016/5/11/chartex" xmlns:cx6="http://schemas.microsoft.com/office/drawing/2016/5/12/chartex" xmlns:cx7="http://schemas.microsoft.com/office/drawing/2016/5/13/chartex" xmlns:cx8="http://schemas.microsoft.com/office/drawing/2016/5/14/chartex" xmlns:mc="http://schemas.openxmlformats.org/markup-compatibility/2006" xmlns:aink="http://schemas.microsoft.com/office/drawing/2016/ink" xmlns:am3d="http://schemas.microsoft.com/office/drawing/2017/model3d" xmlns:o="urn:schemas-microsoft-com:office:office" xmlns:oel="http://schemas.microsoft.com/office/2019/extlst" xmlns:r="http://schemas.openxmlformats.org/officeDocument/2006/relationships" xmlns:m="http://schemas.openxmlformats.org/officeDocument/2006/math" xmlns:v="urn:schemas-microsoft-com:vml" xmlns:wp14="http://schemas.microsoft.com/office/word/2010/wordprocessingDrawing" xmlns:wp="http://schemas.openxmlformats.org/drawingml/2006/wordprocessingDrawing" xmlns:w10="urn:schemas-microsoft-com:office:word" xmlns:w="http://schemas.openxmlformats.org/wordprocessingml/2006/main" xmlns:w14="http://schemas.microsoft.com/office/word/2010/wordml" xmlns:w15="http://schemas.microsoft.com/office/word/2012/wordml" xmlns:w16cex="http://schemas.microsoft.com/office/word/2018/wordml/cex" xmlns:w16cid="http://schemas.microsoft.com/office/word/2016/wordml/cid" xmlns:w16="http://schemas.microsoft.com/office/word/2018/wordml" xmlns:w16du="http://schemas.microsoft.com/office/word/2023/wordml/word16du" xmlns:w16sdtdh="http://schemas.microsoft.com/office/word/2020/wordml/sdtdatahash" xmlns:w16sdtfl="http://schemas.microsoft.com/office/word/2024/wordml/sdtformatlock" xmlns:w16se="http://schemas.microsoft.com/office/word/2015/wordml/symex" xmlns:wpg="http://schemas.microsoft.com/office/word/2010/wordprocessingGroup" xmlns:wpi="http://schemas.microsoft.com/office/word/2010/wordprocessingInk" xmlns:wne="http://schemas.microsoft.com/office/word/2006/wordml" xmlns:wps="http://schemas.microsoft.com/office/word/2010/wordprocessingShape" mc:Ignorable="w14 w15 w16se w16cid w16 w16cex w16sdtdh w16sdtfl w16du wp14">
+  <w:p>
+    <w:pPr>
+      <w:pStyle w:val="Footer"/>
+    </w:pPr>
+    <w:r>
+      <w:rPr>
+        <w:noProof/>
+      </w:rPr>
+      <mc:AlternateContent>
+        <mc:Choice Requires="wps">
+          <w:drawing>
+            <wp:anchor distT="0" distB="0" distL="0" distR="0" simplePos="0" relativeHeight="251658240" behindDoc="0" locked="0" layoutInCell="1" allowOverlap="1" wp14:anchorId="36BB5F68" wp14:editId="5E134B62">
+              <wp:simplePos x="635" y="635"/>
+              <wp:positionH relativeFrom="page">
+                <wp:align>left</wp:align>
+              </wp:positionH>
+              <wp:positionV relativeFrom="page">
+                <wp:align>bottom</wp:align>
+              </wp:positionV>
+              <wp:extent cx="1855470" cy="333375"/>
+              <wp:effectExtent l="0" t="0" r="11430" b="0"/>
+              <wp:wrapNone/>
+              <wp:docPr id="1986346857" name="Text Box 1" descr="Regent's University London - Internal">
+                <a:extLst xmlns:a="http://schemas.openxmlformats.org/drawingml/2006/main">
+                  <a:ext uri="{5AE41FA2-C0FF-4470-9BD4-5FADCA87CBE2}">
+                    <aclsh:classification xmlns:aclsh="http://schemas.microsoft.com/office/drawing/2020/classificationShape" classificationOutcomeType="ftr"/>
+                  </a:ext>
+                </a:extLst>
+              </wp:docPr>
+              <wp:cNvGraphicFramePr/>
+              <a:graphic xmlns:a="http://schemas.openxmlformats.org/drawingml/2006/main">
+                <a:graphicData uri="http://schemas.microsoft.com/office/word/2010/wordprocessingShape">
+                  <wps:wsp>
+                    <wps:cNvSpPr txBox="1"/>
+                    <wps:spPr>
+                      <a:xfrm>
+                        <a:off x="0" y="0"/>
+                        <a:ext cx="1855470" cy="333375"/>
+                      </a:xfrm>
+                      <a:prstGeom prst="rect">
+                        <a:avLst/>
+                      </a:prstGeom>
+                      <a:noFill/>
+                      <a:ln>
+                        <a:noFill/>
+                      </a:ln>
+                    </wps:spPr>
+                    <wps:txbx>
+                      <w:txbxContent>
+                        <w:p>
+                          <w:pPr>
+                            <w:spacing w:after="0"/>
+                            <w:rPr>
+                              <w:rFonts w:ascii="Aptos" w:eastAsia="Aptos" w:hAnsi="Aptos" w:cs="Aptos"/>
+                              <w:noProof/>
+                              <w:color w:val="000000"/>
+                              <w:sz w:val="16"/>
+                              <w:szCs w:val="16"/>
+                            </w:rPr>
+                          </w:pPr>
+                          <w:r>
+                            <w:rPr>
+                              <w:rFonts w:ascii="Aptos" w:eastAsia="Aptos" w:hAnsi="Aptos" w:cs="Aptos"/>
+                              <w:noProof/>
+                              <w:color w:val="000000"/>
+                              <w:sz w:val="16"/>
+                              <w:szCs w:val="16"/>
+                            </w:rPr>
+                            <w:t>Regent's University London - Internal</w:t>
+                          </w:r>
+                        </w:p>
+                      </w:txbxContent>
+                    </wps:txbx>
+                    <wps:bodyPr rot="0" spcFirstLastPara="0" vertOverflow="overflow" horzOverflow="overflow" vert="horz" wrap="none" lIns="254000" tIns="0" rIns="0" bIns="190500" numCol="1" spcCol="0" rtlCol="0" fromWordArt="0" anchor="b" anchorCtr="0" forceAA="0" compatLnSpc="1">
+                      <a:prstTxWarp prst="textNoShape">
+                        <a:avLst/>
+                      </a:prstTxWarp>
+                      <a:spAutoFit/>
+                    </wps:bodyPr>
+                  </wps:wsp>
+                </a:graphicData>
+              </a:graphic>
+            </wp:anchor>
+          </w:drawing>
+        </mc:Choice>
+        <mc:Fallback>
+          <w:pict>
+            <v:shapetype w14:anchorId="36BB5F68" id="_x0000_t202" coordsize="21600,21600" o:spt="202" path="m,l,21600r21600,l21600,xe">
+              <v:stroke joinstyle="miter"/>
+              <v:path gradientshapeok="t" o:connecttype="rect"/>
+            </v:shapetype>
+            <v:shape id="Text Box 1" o:spid="_x0000_s1028" type="#_x0000_t202" alt="Regent's University London - Internal" style="position:absolute;margin-left:0;margin-top:0;width:146.1pt;height:26.25pt;z-index:251658240;visibility:visible;mso-wrap-style:none;mso-wrap-distance-left:0;mso-wrap-distance-top:0;mso-wrap-distance-right:0;mso-wrap-distance-bottom:0;mso-position-horizontal:left;mso-position-horizontal-relative:page;mso-position-vertical:bottom;mso-position-vertical-relative:page;v-text-anchor:bottom" o:gfxdata="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" filled="f" stroked="f">
+              <v:textbox style="mso-fit-shape-to-text:t" inset="20pt,0,0,15pt">
+                <w:txbxContent>
+                  <w:p>
+                    <w:pPr>
+                      <w:spacing w:after="0"/>
+                      <w:rPr>
+                        <w:rFonts w:ascii="Aptos" w:eastAsia="Aptos" w:hAnsi="Aptos" w:cs="Aptos"/>
+                        <w:noProof/>
+                        <w:color w:val="000000"/>
+                        <w:sz w:val="16"/>
+                        <w:szCs w:val="16"/>
+                      </w:rPr>
+                    </w:pPr>
+                    <w:r>
+                      <w:rPr>
+                        <w:rFonts w:ascii="Aptos" w:eastAsia="Aptos" w:hAnsi="Aptos" w:cs="Aptos"/>
+                        <w:noProof/>
+                        <w:color w:val="000000"/>
+                        <w:sz w:val="16"/>
+                        <w:szCs w:val="16"/>
+                      </w:rPr>
+                      <w:t>Regent's University London - Internal</w:t>
+                    </w:r>
+                  </w:p>
+                </w:txbxContent>
+              </v:textbox>
+              <w10:wrap anchorx="page" anchory="page"/>
+            </v:shape>
+          </w:pict>
+        </mc:Fallback>
+      </mc:AlternateContent>
     </w:r>
   </w:p>
 </w:ftr>
@@ -3658,7 +3818,7 @@
         <w:noProof/>
       </w:rPr>
       <w:drawing>
-        <wp:inline distT="0" distB="0" distL="0" distR="0" wp14:anchorId="72CE28E5" wp14:editId="6A03DC2A">
+        <wp:inline distT="0" distB="0" distL="0" distR="0" wp14:anchorId="11E2B8FB" wp14:editId="41DF2BCE">
           <wp:extent cx="1188720" cy="370429"/>
           <wp:effectExtent l="0" t="0" r="0" b="0"/>
           <wp:docPr id="1" name="Picture 1"/>
@@ -3870,383 +4030,32 @@
       </w:rPr>
     </w:lvl>
   </w:abstractNum>
-  <w:abstractNum w:abstractNumId="9" w15:restartNumberingAfterBreak="0">
-    <w:nsid w:val="13EB5F0E"/>
-    <w:multiLevelType w:val="hybridMultilevel"/>
-    <w:tmpl w:val="EA80CF2A"/>
-    <w:lvl w:ilvl="0" w:tplc="56D24192">
-      <w:numFmt w:val="bullet"/>
-      <w:lvlText w:val="-"/>
-      <w:lvlJc w:val="left"/>
-      <w:pPr>
-        <w:ind w:left="420" w:hanging="360"/>
-      </w:pPr>
-      <w:rPr>
-        <w:rFonts w:ascii="Avenir Next LT Pro" w:eastAsiaTheme="minorEastAsia" w:hAnsi="Avenir Next LT Pro" w:cstheme="minorBidi" w:hint="default"/>
-        <w:color w:val="000000"/>
-      </w:rPr>
-    </w:lvl>
-    <w:lvl w:ilvl="1" w:tplc="08090003" w:tentative="1">
-      <w:start w:val="1"/>
-      <w:numFmt w:val="bullet"/>
-      <w:lvlText w:val="o"/>
-      <w:lvlJc w:val="left"/>
-      <w:pPr>
-        <w:ind w:left="1140" w:hanging="360"/>
-      </w:pPr>
-      <w:rPr>
-        <w:rFonts w:ascii="Courier New" w:hAnsi="Courier New" w:cs="Courier New" w:hint="default"/>
-      </w:rPr>
-    </w:lvl>
-    <w:lvl w:ilvl="2" w:tplc="08090005" w:tentative="1">
-      <w:start w:val="1"/>
-      <w:numFmt w:val="bullet"/>
-      <w:lvlText w:val=""/>
-      <w:lvlJc w:val="left"/>
-      <w:pPr>
-        <w:ind w:left="1860" w:hanging="360"/>
-      </w:pPr>
-      <w:rPr>
-        <w:rFonts w:ascii="Wingdings" w:hAnsi="Wingdings" w:hint="default"/>
-      </w:rPr>
-    </w:lvl>
-    <w:lvl w:ilvl="3" w:tplc="08090001" w:tentative="1">
-      <w:start w:val="1"/>
-      <w:numFmt w:val="bullet"/>
-      <w:lvlText w:val=""/>
-      <w:lvlJc w:val="left"/>
-      <w:pPr>
-        <w:ind w:left="2580" w:hanging="360"/>
-      </w:pPr>
-      <w:rPr>
-        <w:rFonts w:ascii="Symbol" w:hAnsi="Symbol" w:hint="default"/>
-      </w:rPr>
-    </w:lvl>
-    <w:lvl w:ilvl="4" w:tplc="08090003" w:tentative="1">
-      <w:start w:val="1"/>
-      <w:numFmt w:val="bullet"/>
-      <w:lvlText w:val="o"/>
-      <w:lvlJc w:val="left"/>
-      <w:pPr>
-        <w:ind w:left="3300" w:hanging="360"/>
-      </w:pPr>
-      <w:rPr>
-        <w:rFonts w:ascii="Courier New" w:hAnsi="Courier New" w:cs="Courier New" w:hint="default"/>
-      </w:rPr>
-    </w:lvl>
-    <w:lvl w:ilvl="5" w:tplc="08090005" w:tentative="1">
-      <w:start w:val="1"/>
-      <w:numFmt w:val="bullet"/>
-      <w:lvlText w:val=""/>
-      <w:lvlJc w:val="left"/>
-      <w:pPr>
-        <w:ind w:left="4020" w:hanging="360"/>
-      </w:pPr>
-      <w:rPr>
-        <w:rFonts w:ascii="Wingdings" w:hAnsi="Wingdings" w:hint="default"/>
-      </w:rPr>
-    </w:lvl>
-    <w:lvl w:ilvl="6" w:tplc="08090001" w:tentative="1">
-      <w:start w:val="1"/>
-      <w:numFmt w:val="bullet"/>
-      <w:lvlText w:val=""/>
-      <w:lvlJc w:val="left"/>
-      <w:pPr>
-        <w:ind w:left="4740" w:hanging="360"/>
-      </w:pPr>
-      <w:rPr>
-        <w:rFonts w:ascii="Symbol" w:hAnsi="Symbol" w:hint="default"/>
-      </w:rPr>
-    </w:lvl>
-    <w:lvl w:ilvl="7" w:tplc="08090003" w:tentative="1">
-      <w:start w:val="1"/>
-      <w:numFmt w:val="bullet"/>
-      <w:lvlText w:val="o"/>
-      <w:lvlJc w:val="left"/>
-      <w:pPr>
-        <w:ind w:left="5460" w:hanging="360"/>
-      </w:pPr>
-      <w:rPr>
-        <w:rFonts w:ascii="Courier New" w:hAnsi="Courier New" w:cs="Courier New" w:hint="default"/>
-      </w:rPr>
-    </w:lvl>
-    <w:lvl w:ilvl="8" w:tplc="08090005" w:tentative="1">
-      <w:start w:val="1"/>
-      <w:numFmt w:val="bullet"/>
-      <w:lvlText w:val=""/>
-      <w:lvlJc w:val="left"/>
-      <w:pPr>
-        <w:ind w:left="6180" w:hanging="360"/>
-      </w:pPr>
-      <w:rPr>
-        <w:rFonts w:ascii="Wingdings" w:hAnsi="Wingdings" w:hint="default"/>
-      </w:rPr>
-    </w:lvl>
-  </w:abstractNum>
-  <w:abstractNum w:abstractNumId="10" w15:restartNumberingAfterBreak="0">
-    <w:nsid w:val="46CC3464"/>
-    <w:multiLevelType w:val="hybridMultilevel"/>
-    <w:tmpl w:val="BB6463B6"/>
-    <w:lvl w:ilvl="0" w:tplc="4DDC81E6">
-      <w:numFmt w:val="bullet"/>
-      <w:lvlText w:val="-"/>
-      <w:lvlJc w:val="left"/>
-      <w:pPr>
-        <w:ind w:left="470" w:hanging="360"/>
-      </w:pPr>
-      <w:rPr>
-        <w:rFonts w:ascii="Avenir Next LT Pro" w:eastAsiaTheme="minorEastAsia" w:hAnsi="Avenir Next LT Pro" w:cstheme="minorBidi" w:hint="default"/>
-        <w:color w:val="000000"/>
-      </w:rPr>
-    </w:lvl>
-    <w:lvl w:ilvl="1" w:tplc="08090003" w:tentative="1">
-      <w:start w:val="1"/>
-      <w:numFmt w:val="bullet"/>
-      <w:lvlText w:val="o"/>
-      <w:lvlJc w:val="left"/>
-      <w:pPr>
-        <w:ind w:left="1190" w:hanging="360"/>
-      </w:pPr>
-      <w:rPr>
-        <w:rFonts w:ascii="Courier New" w:hAnsi="Courier New" w:cs="Courier New" w:hint="default"/>
-      </w:rPr>
-    </w:lvl>
-    <w:lvl w:ilvl="2" w:tplc="08090005" w:tentative="1">
-      <w:start w:val="1"/>
-      <w:numFmt w:val="bullet"/>
-      <w:lvlText w:val=""/>
-      <w:lvlJc w:val="left"/>
-      <w:pPr>
-        <w:ind w:left="1910" w:hanging="360"/>
-      </w:pPr>
-      <w:rPr>
-        <w:rFonts w:ascii="Wingdings" w:hAnsi="Wingdings" w:hint="default"/>
-      </w:rPr>
-    </w:lvl>
-    <w:lvl w:ilvl="3" w:tplc="08090001" w:tentative="1">
-      <w:start w:val="1"/>
-      <w:numFmt w:val="bullet"/>
-      <w:lvlText w:val=""/>
-      <w:lvlJc w:val="left"/>
-      <w:pPr>
-        <w:ind w:left="2630" w:hanging="360"/>
-      </w:pPr>
-      <w:rPr>
-        <w:rFonts w:ascii="Symbol" w:hAnsi="Symbol" w:hint="default"/>
-      </w:rPr>
-    </w:lvl>
-    <w:lvl w:ilvl="4" w:tplc="08090003" w:tentative="1">
-      <w:start w:val="1"/>
-      <w:numFmt w:val="bullet"/>
-      <w:lvlText w:val="o"/>
-      <w:lvlJc w:val="left"/>
-      <w:pPr>
-        <w:ind w:left="3350" w:hanging="360"/>
-      </w:pPr>
-      <w:rPr>
-        <w:rFonts w:ascii="Courier New" w:hAnsi="Courier New" w:cs="Courier New" w:hint="default"/>
-      </w:rPr>
-    </w:lvl>
-    <w:lvl w:ilvl="5" w:tplc="08090005" w:tentative="1">
-      <w:start w:val="1"/>
-      <w:numFmt w:val="bullet"/>
-      <w:lvlText w:val=""/>
-      <w:lvlJc w:val="left"/>
-      <w:pPr>
-        <w:ind w:left="4070" w:hanging="360"/>
-      </w:pPr>
-      <w:rPr>
-        <w:rFonts w:ascii="Wingdings" w:hAnsi="Wingdings" w:hint="default"/>
-      </w:rPr>
-    </w:lvl>
-    <w:lvl w:ilvl="6" w:tplc="08090001" w:tentative="1">
-      <w:start w:val="1"/>
-      <w:numFmt w:val="bullet"/>
-      <w:lvlText w:val=""/>
-      <w:lvlJc w:val="left"/>
-      <w:pPr>
-        <w:ind w:left="4790" w:hanging="360"/>
-      </w:pPr>
-      <w:rPr>
-        <w:rFonts w:ascii="Symbol" w:hAnsi="Symbol" w:hint="default"/>
-      </w:rPr>
-    </w:lvl>
-    <w:lvl w:ilvl="7" w:tplc="08090003" w:tentative="1">
-      <w:start w:val="1"/>
-      <w:numFmt w:val="bullet"/>
-      <w:lvlText w:val="o"/>
-      <w:lvlJc w:val="left"/>
-      <w:pPr>
-        <w:ind w:left="5510" w:hanging="360"/>
-      </w:pPr>
-      <w:rPr>
-        <w:rFonts w:ascii="Courier New" w:hAnsi="Courier New" w:cs="Courier New" w:hint="default"/>
-      </w:rPr>
-    </w:lvl>
-    <w:lvl w:ilvl="8" w:tplc="08090005" w:tentative="1">
-      <w:start w:val="1"/>
-      <w:numFmt w:val="bullet"/>
-      <w:lvlText w:val=""/>
-      <w:lvlJc w:val="left"/>
-      <w:pPr>
-        <w:ind w:left="6230" w:hanging="360"/>
-      </w:pPr>
-      <w:rPr>
-        <w:rFonts w:ascii="Wingdings" w:hAnsi="Wingdings" w:hint="default"/>
-      </w:rPr>
-    </w:lvl>
-  </w:abstractNum>
-  <w:abstractNum w:abstractNumId="11" w15:restartNumberingAfterBreak="0">
-    <w:nsid w:val="57D24D08"/>
-    <w:multiLevelType w:val="hybridMultilevel"/>
-    <w:tmpl w:val="BDF63CE8"/>
-    <w:lvl w:ilvl="0" w:tplc="26CE378E">
-      <w:numFmt w:val="bullet"/>
-      <w:lvlText w:val="-"/>
-      <w:lvlJc w:val="left"/>
-      <w:pPr>
-        <w:ind w:left="420" w:hanging="360"/>
-      </w:pPr>
-      <w:rPr>
-        <w:rFonts w:ascii="Avenir Next LT Pro" w:eastAsiaTheme="minorEastAsia" w:hAnsi="Avenir Next LT Pro" w:cstheme="minorBidi" w:hint="default"/>
-        <w:color w:val="000000"/>
-      </w:rPr>
-    </w:lvl>
-    <w:lvl w:ilvl="1" w:tplc="08090003" w:tentative="1">
-      <w:start w:val="1"/>
-      <w:numFmt w:val="bullet"/>
-      <w:lvlText w:val="o"/>
-      <w:lvlJc w:val="left"/>
-      <w:pPr>
-        <w:ind w:left="1140" w:hanging="360"/>
-      </w:pPr>
-      <w:rPr>
-        <w:rFonts w:ascii="Courier New" w:hAnsi="Courier New" w:cs="Courier New" w:hint="default"/>
-      </w:rPr>
-    </w:lvl>
-    <w:lvl w:ilvl="2" w:tplc="08090005" w:tentative="1">
-      <w:start w:val="1"/>
-      <w:numFmt w:val="bullet"/>
-      <w:lvlText w:val=""/>
-      <w:lvlJc w:val="left"/>
-      <w:pPr>
-        <w:ind w:left="1860" w:hanging="360"/>
-      </w:pPr>
-      <w:rPr>
-        <w:rFonts w:ascii="Wingdings" w:hAnsi="Wingdings" w:hint="default"/>
-      </w:rPr>
-    </w:lvl>
-    <w:lvl w:ilvl="3" w:tplc="08090001" w:tentative="1">
-      <w:start w:val="1"/>
-      <w:numFmt w:val="bullet"/>
-      <w:lvlText w:val=""/>
-      <w:lvlJc w:val="left"/>
-      <w:pPr>
-        <w:ind w:left="2580" w:hanging="360"/>
-      </w:pPr>
-      <w:rPr>
-        <w:rFonts w:ascii="Symbol" w:hAnsi="Symbol" w:hint="default"/>
-      </w:rPr>
-    </w:lvl>
-    <w:lvl w:ilvl="4" w:tplc="08090003" w:tentative="1">
-      <w:start w:val="1"/>
-      <w:numFmt w:val="bullet"/>
-      <w:lvlText w:val="o"/>
-      <w:lvlJc w:val="left"/>
-      <w:pPr>
-        <w:ind w:left="3300" w:hanging="360"/>
-      </w:pPr>
-      <w:rPr>
-        <w:rFonts w:ascii="Courier New" w:hAnsi="Courier New" w:cs="Courier New" w:hint="default"/>
-      </w:rPr>
-    </w:lvl>
-    <w:lvl w:ilvl="5" w:tplc="08090005" w:tentative="1">
-      <w:start w:val="1"/>
-      <w:numFmt w:val="bullet"/>
-      <w:lvlText w:val=""/>
-      <w:lvlJc w:val="left"/>
-      <w:pPr>
-        <w:ind w:left="4020" w:hanging="360"/>
-      </w:pPr>
-      <w:rPr>
-        <w:rFonts w:ascii="Wingdings" w:hAnsi="Wingdings" w:hint="default"/>
-      </w:rPr>
-    </w:lvl>
-    <w:lvl w:ilvl="6" w:tplc="08090001" w:tentative="1">
-      <w:start w:val="1"/>
-      <w:numFmt w:val="bullet"/>
-      <w:lvlText w:val=""/>
-      <w:lvlJc w:val="left"/>
-      <w:pPr>
-        <w:ind w:left="4740" w:hanging="360"/>
-      </w:pPr>
-      <w:rPr>
-        <w:rFonts w:ascii="Symbol" w:hAnsi="Symbol" w:hint="default"/>
-      </w:rPr>
-    </w:lvl>
-    <w:lvl w:ilvl="7" w:tplc="08090003" w:tentative="1">
-      <w:start w:val="1"/>
-      <w:numFmt w:val="bullet"/>
-      <w:lvlText w:val="o"/>
-      <w:lvlJc w:val="left"/>
-      <w:pPr>
-        <w:ind w:left="5460" w:hanging="360"/>
-      </w:pPr>
-      <w:rPr>
-        <w:rFonts w:ascii="Courier New" w:hAnsi="Courier New" w:cs="Courier New" w:hint="default"/>
-      </w:rPr>
-    </w:lvl>
-    <w:lvl w:ilvl="8" w:tplc="08090005" w:tentative="1">
-      <w:start w:val="1"/>
-      <w:numFmt w:val="bullet"/>
-      <w:lvlText w:val=""/>
-      <w:lvlJc w:val="left"/>
-      <w:pPr>
-        <w:ind w:left="6180" w:hanging="360"/>
-      </w:pPr>
-      <w:rPr>
-        <w:rFonts w:ascii="Wingdings" w:hAnsi="Wingdings" w:hint="default"/>
-      </w:rPr>
-    </w:lvl>
-  </w:abstractNum>
-  <w:num w:numId="1" w16cid:durableId="370227223">
+  <w:num w:numId="1" w16cid:durableId="1209562286">
     <w:abstractNumId w:val="8"/>
   </w:num>
-  <w:num w:numId="2" w16cid:durableId="1970820205">
+  <w:num w:numId="2" w16cid:durableId="1208645292">
     <w:abstractNumId w:val="6"/>
   </w:num>
-  <w:num w:numId="3" w16cid:durableId="1309704106">
+  <w:num w:numId="3" w16cid:durableId="1547371858">
     <w:abstractNumId w:val="5"/>
   </w:num>
-  <w:num w:numId="4" w16cid:durableId="360789735">
+  <w:num w:numId="4" w16cid:durableId="1383990330">
     <w:abstractNumId w:val="4"/>
   </w:num>
-  <w:num w:numId="5" w16cid:durableId="293482941">
+  <w:num w:numId="5" w16cid:durableId="1388336425">
     <w:abstractNumId w:val="7"/>
   </w:num>
-  <w:num w:numId="6" w16cid:durableId="363335007">
+  <w:num w:numId="6" w16cid:durableId="1953439697">
     <w:abstractNumId w:val="3"/>
   </w:num>
-  <w:num w:numId="7" w16cid:durableId="110907256">
+  <w:num w:numId="7" w16cid:durableId="1967470579">
     <w:abstractNumId w:val="2"/>
   </w:num>
-  <w:num w:numId="8" w16cid:durableId="1298758171">
+  <w:num w:numId="8" w16cid:durableId="345865185">
     <w:abstractNumId w:val="1"/>
   </w:num>
-  <w:num w:numId="9" w16cid:durableId="978417625">
+  <w:num w:numId="9" w16cid:durableId="1615016002">
     <w:abstractNumId w:val="0"/>
-  </w:num>
-  <w:num w:numId="10" w16cid:durableId="897210151">
-    <w:abstractNumId w:val="9"/>
-  </w:num>
-  <w:num w:numId="11" w16cid:durableId="283199749">
-    <w:abstractNumId w:val="11"/>
-  </w:num>
-  <w:num w:numId="12" w16cid:durableId="2013333634">
-    <w:abstractNumId w:val="10"/>
-  </w:num>
-  <w:num w:numId="13" w16cid:durableId="993097101">
-    <w:abstractNumId w:val="8"/>
   </w:num>
 </w:numbering>
 </file>
@@ -15971,4 +15780,10 @@
     <ds:schemaRef ds:uri="http://schemas.openxmlformats.org/officeDocument/2006/bibliography"/>
   </ds:schemaRefs>
 </ds:datastoreItem>
+</file>
+
+<file path=docMetadata/LabelInfo.xml><?xml version="1.0" encoding="utf-8"?>
+<clbl:labelList xmlns:clbl="http://schemas.microsoft.com/office/2020/mipLabelMetadata">
+  <clbl:label id="{b2396176-4a7a-447e-9b5d-f72b014d4a0f}" enabled="1" method="Standard" siteId="{b40c8424-283d-4a7a-a31b-80b82fee1303}" contentBits="2" removed="0"/>
+</clbl:labelList>
 </file>
</xml_diff>

<commit_message>
Add configurable MLO rendering pipeline and finalize typography defaults
</commit_message>
<xml_diff>
--- a/input/DSC502_Learner_Journey_Map.docx
+++ b/input/DSC502_Learner_Journey_Map.docx
@@ -253,7 +253,13 @@
               <w:rPr>
                 <w:color w:val="000000"/>
               </w:rPr>
-              <w:t xml:space="preserve"> Examine and apply statistical and coding concepts and theories.</w:t>
+              <w:t xml:space="preserve"> Examine and apply statistical and coding concepts and theories</w:t>
+            </w:r>
+            <w:r>
+              <w:rPr>
+                <w:color w:val="000000"/>
+              </w:rPr>
+              <w:t>.</w:t>
             </w:r>
           </w:p>
         </w:tc>
@@ -386,10 +392,13 @@
               <w:spacing w:after="20"/>
             </w:pPr>
             <w:r>
+              <w:lastRenderedPageBreak/>
+              <w:br w:type="page"/>
+            </w:r>
+            <w:r>
               <w:rPr>
                 <w:color w:val="F3F5F2"/>
               </w:rPr>
-              <w:lastRenderedPageBreak/>
               <w:t>1</w:t>
             </w:r>
           </w:p>
@@ -461,18 +470,6 @@
               <w:rPr>
                 <w:color w:val="000000"/>
               </w:rPr>
-              <w:t>The coding environment landscape</w:t>
-            </w:r>
-          </w:p>
-          <w:p>
-            <w:pPr>
-              <w:pStyle w:val="ListBullet"/>
-              <w:spacing w:after="20"/>
-            </w:pPr>
-            <w:r>
-              <w:rPr>
-                <w:color w:val="000000"/>
-              </w:rPr>
               <w:t>Variables and data types</w:t>
             </w:r>
           </w:p>
@@ -573,6 +570,9 @@
           <w:p>
             <w:pPr>
               <w:spacing w:after="20"/>
+              <w:rPr>
+                <w:color w:val="000000"/>
+              </w:rPr>
             </w:pPr>
             <w:r>
               <w:rPr>
@@ -580,6 +580,31 @@
               </w:rPr>
               <w:t>Assessment brief published on Blackboard</w:t>
             </w:r>
+            <w:r>
+              <w:rPr>
+                <w:color w:val="000000"/>
+              </w:rPr>
+              <w:t>.</w:t>
+            </w:r>
+          </w:p>
+          <w:p>
+            <w:pPr>
+              <w:spacing w:after="20"/>
+              <w:rPr>
+                <w:color w:val="000000"/>
+              </w:rPr>
+            </w:pPr>
+            <w:r>
+              <w:rPr>
+                <w:color w:val="000000"/>
+              </w:rPr>
+              <w:t>Assessment brief discussed in session. Summative project work begins.</w:t>
+            </w:r>
+          </w:p>
+          <w:p>
+            <w:pPr>
+              <w:spacing w:after="20"/>
+            </w:pPr>
           </w:p>
         </w:tc>
         <w:tc>
@@ -1809,6 +1834,12 @@
               </w:rPr>
               <w:t>Assessment brief discussed in session. Summative project work begins.</w:t>
             </w:r>
+            <w:r>
+              <w:rPr>
+                <w:color w:val="000000"/>
+              </w:rPr>
+              <w:t xml:space="preserve"> Assessment brief discussed in session. Summative project work begins. Assessment brief discussed in session. Summative project work begins.</w:t>
+            </w:r>
           </w:p>
         </w:tc>
         <w:tc>
@@ -2627,13 +2658,7 @@
               <w:rPr>
                 <w:color w:val="000000"/>
               </w:rPr>
-              <w:t xml:space="preserve">. </w:t>
-            </w:r>
-            <w:r>
-              <w:rPr>
-                <w:color w:val="000000"/>
-              </w:rPr>
-              <w:t>You embed a real AI feature into your application by calling a language model from Python</w:t>
+              <w:t>. You embed a real AI feature into your application by calling a language model from Python</w:t>
             </w:r>
           </w:p>
           <w:p>

</xml_diff>